<commit_message>
Revisar redacción del informe con tono más natural
</commit_message>
<xml_diff>
--- a/informe/Informe_Blas_Pinto_Semana_9.docx
+++ b/informe/Informe_Blas_Pinto_Semana_9.docx
@@ -805,7 +805,7 @@
         <w:spacing w:after="120" w:line="276" w:lineRule="auto"/>
       </w:pPr>
       <w:r>
-        <w:t>El objetivo de esta actividad es automatizar el alta y la baja de productos de una empresa que vende artículos electrónicos. Para resolver el caso, implementé las tablas Productos y AuditoriaInventario, procedimientos almacenados y triggers que conservan el historial de movimientos [1].</w:t>
+        <w:t>En esta actividad trabajé con un inventario de productos electrónicos. La idea era registrar las altas y bajas y conservar un historial de los movimientos. Para resolverlo, la solución utiliza las tablas Productos y AuditoriaInventario, procedimientos almacenados y triggers [1].</w:t>
       </w:r>
     </w:p>
     <w:p>
@@ -813,7 +813,7 @@
         <w:spacing w:after="120" w:line="276" w:lineRule="auto"/>
       </w:pPr>
       <w:r>
-        <w:t>La solución se probó en SQL Server 2022 Express LocalDB con productos ficticios. Se compararon los estados antes y después de cada operación y se revisaron los mensajes. El cierre confirmó cero productos y diez registros de auditoría: cuatro INS, cuatro DEL y dos UPD. También se incorporaron actualización condicional y cursor para abordar los aspectos adicionales de la rúbrica.</w:t>
+        <w:t>Las pruebas se hicieron en SQL Server 2022 Express LocalDB con productos ficticios. Para comprobar cada operación, se revisaron las tablas antes y después, junto con los mensajes del motor. Al finalizar quedaron cero productos y diez movimientos: cuatro INS, cuatro DEL y dos UPD. La actualización condicional y el cursor complementan los puntos de la rúbrica.</w:t>
       </w:r>
     </w:p>
     <w:p>
@@ -821,7 +821,7 @@
         <w:spacing w:after="120" w:line="276" w:lineRule="auto"/>
       </w:pPr>
       <w:r>
-        <w:t>Las capturas son de un visor local de resultados obtenidos mediante .NET SqlClient, no de la interfaz de SQL Server Management Studio. La ejecución real se realizó el 8 de octubre de 2026; las capturas de lectura y este informe se prepararon el 9 de octubre. El registro completo y las evidencias F01 a F35 se conservan en el repositorio.</w:t>
+        <w:t>Las capturas muestran un visor local de resultados obtenidos con .NET SqlClient; no corresponden a la pantalla de SQL Server Management Studio. Las consultas se ejecutaron el 8 de octubre de 2026 y las capturas de lectura se prepararon el día 9. En el repositorio están el registro completo y las evidencias F01 a F35.</w:t>
       </w:r>
     </w:p>
     <w:p>
@@ -851,7 +851,7 @@
         <w:spacing w:after="120" w:line="276" w:lineRule="auto"/>
       </w:pPr>
       <w:r>
-        <w:t>Se utilizó SQL Server 2022 Express LocalDB 16.0.1000.6, instancia (localdb)\MSSQLLocalDB, con autenticación de Windows. Las pruebas se ejecutaron en la base exclusiva PRO202_Evidencias_20261008_163918.</w:t>
+        <w:t>El entorno de pruebas fue SQL Server 2022 Express LocalDB 16.0.1000.6, en la instancia (localdb)\MSSQLLocalDB, con autenticación de Windows. Se creó la base PRO202_Evidencias_20261008_163918 exclusivamente para este ejercicio.</w:t>
       </w:r>
     </w:p>
     <w:tbl>
@@ -1100,7 +1100,7 @@
         <w:spacing w:after="120" w:line="276" w:lineRule="auto"/>
       </w:pPr>
       <w:r>
-        <w:t>Como decisión de diseño, se rechazaron nombres nulos o vacíos y valores nulos o negativos en stock y precio. Cero es válido; esa prueba se revirtió mediante ROLLBACK. Son validaciones propuestas, ya que el enunciado no define esos límites. La auditoría conserva el ID tras una baja, por lo que no tiene clave foránea hacia Productos.</w:t>
+        <w:t>Para evitar datos incompletos, se validaron los nombres vacíos o nulos y los valores nulos o negativos de stock y precio. Cero se aceptó como valor válido y esa prueba se deshizo con ROLLBACK. Son decisiones de diseño, porque el enunciado no fija esos límites. La auditoría conserva el ID después de una baja; por eso no tiene clave foránea hacia Productos.</w:t>
       </w:r>
     </w:p>
     <w:p>
@@ -1119,7 +1119,7 @@
         <w:spacing w:after="120" w:line="276" w:lineRule="auto"/>
       </w:pPr>
       <w:r>
-        <w:t>sp_AltaProducto recibe @Nombre, @Stock y @Precio, valida sus valores y realiza INSERT dentro de TRY. En CATCH informa ERROR_MESSAGE() y propaga el error con THROW [3]. El alta de un Teclado de prueba, stock 10 y precio 19990, creó el ID 1 y una acción INS; la Figura 1 muestra ambas tablas antes y después.</w:t>
+        <w:t>Para dar de alta un producto, sp_AltaProducto recibe @Nombre, @Stock y @Precio. Revisa los valores y ejecuta INSERT dentro de TRY. Si algo falla, CATCH muestra ERROR_MESSAGE() y THROW transmite el error [3]. La prueba con un teclado, stock 10 y precio 19990, creó el ID 1 y un INS. La Figura 1 permite comparar ambas tablas antes y después.</w:t>
       </w:r>
     </w:p>
     <w:p>
@@ -1127,7 +1127,7 @@
         <w:spacing w:after="120" w:line="276" w:lineRule="auto"/>
       </w:pPr>
       <w:r>
-        <w:t>sp_BajaProducto recibe un ID positivo, ejecuta DELETE y consulta @@ROWCOUNT. Informa si eliminó el producto o si no existe. La baja del ID 1 conservó el INS y agregó DEL; el ID 2147483647 produjo «Producto no existe.» sin cambios. Las Figuras 2 y 3 documentan estos casos. Un ID negativo activó CATCH, como muestra la Figura 5.</w:t>
+        <w:t>Para la baja, sp_BajaProducto recibe un ID positivo y comprueba con @@ROWCOUNT si DELETE eliminó una fila. Al borrar el ID 1, se conservó el INS y se agregó DEL. Con el ID 2147483647 apareció «Producto no existe.» y las tablas no cambiaron (Figuras 2 y 3). El ID negativo produjo un error controlado en CATCH (Figura 5).</w:t>
       </w:r>
     </w:p>
     <w:p>
@@ -1146,7 +1146,7 @@
         <w:spacing w:after="120" w:line="276" w:lineRule="auto"/>
       </w:pPr>
       <w:r>
-        <w:t>Los triggers del caso registran una acción por cada fila de inserted o deleted mediante INSERT ... SELECT. Se comprobó también el alta y la baja de dos productos en una sola sentencia. sp_helptrigger identificó los cuatro objetos de la solución (Figura 4).</w:t>
+        <w:t>Los triggers guardan un movimiento por cada fila afectada, usando inserted o deleted e INSERT ... SELECT. Esto también funcionó al insertar y eliminar dos productos en una sola sentencia. La consulta sp_helptrigger permitió revisar los cuatro triggers creados (Figura 4).</w:t>
       </w:r>
     </w:p>
     <w:tbl>
@@ -1533,7 +1533,7 @@
         <w:spacing w:after="120" w:line="276" w:lineRule="auto"/>
       </w:pPr>
       <w:r>
-        <w:t>La rúbrica menciona BEFORE, pero SQL Server ofrece AFTER e INSTEAD OF para este tipo de triggers [2]. La adaptación usa INSTEAD OF UPDATE y se declara expresamente: reemplaza la operación original y no es un BEFORE. Su aceptación corresponde al profesor.</w:t>
+        <w:t>Un punto que hubo que aclarar fue la mención de BEFORE en la rúbrica. SQL Server ofrece AFTER e INSTEAD OF para estos triggers [2]. Se utilizó INSTEAD OF UPDATE para revisar los datos y aplicar los cambios válidos. Reemplaza la operación original; esta adaptación queda explicada para que el profesor la evalúe.</w:t>
       </w:r>
     </w:p>
     <w:p>
@@ -1541,7 +1541,7 @@
         <w:spacing w:after="120" w:line="276" w:lineRule="auto"/>
       </w:pPr>
       <w:r>
-        <w:t>Los stocks 3 y 5 pasaron a 4 y 6 y generaron dos UPD. Luego, SET Stock = Stock no agregó auditoría. El stock negativo y los valores nulos o vacíos inválidos fueron rechazados con error 50005, conservando los datos. Estas comprobaciones están en F16–F18 y F30–F34.</w:t>
+        <w:t>Al aumentar el stock, los valores 3 y 5 pasaron a 4 y 6 y se registraron dos UPD. Repetir los mismos valores con SET Stock = Stock no creó nuevos movimientos. Las actualizaciones inválidas devolvieron el error 50005 y conservaron los datos anteriores. Los resultados están en F16–F18 y F30–F34.</w:t>
       </w:r>
     </w:p>
     <w:p>
@@ -1560,7 +1560,7 @@
         <w:spacing w:after="120" w:line="276" w:lineRule="auto"/>
       </w:pPr>
       <w:r>
-        <w:t>Las altas inválidas y las bajas con ID no válido generaron errores esperados entre 50001 y 50004, sin agregar productos ni movimientos indebidos. La inexistencia de un ID positivo se informa mediante un mensaje, sin tratarla como error de validación. La Figura 5 muestra el rechazo de stock e ID negativos.</w:t>
+        <w:t>También se probaron entradas incorrectas. Las altas inválidas y las bajas con ID no válido devolvieron los errores esperados entre 50001 y 50004, sin agregar productos ni auditorías indebidas. Un ID positivo inexistente solo muestra un mensaje. La Figura 5 reúne las pruebas con stock e ID negativos.</w:t>
       </w:r>
     </w:p>
     <w:p>
@@ -1568,7 +1568,7 @@
         <w:spacing w:after="120" w:line="276" w:lineRule="auto"/>
       </w:pPr>
       <w:r>
-        <w:t>sp_ConsultarInventarioCursor usa LOCAL FAST_FORWARD, FETCH NEXT, CLOSE y DEALLOCATE [4]. Mostró los productos ID 2 y 3 (Figura 6) y no emitió filas ni errores con inventario vacío (F20). Incluye limpieza en CATCH, aunque no se provocó un fallo dentro del recorrido. Se incorporó con finalidad académica; un SELECT basta para listar productos.</w:t>
+        <w:t>El procedimiento sp_ConsultarInventarioCursor recorre los productos con LOCAL FAST_FORWARD y FETCH NEXT; al terminar, usa CLOSE y DEALLOCATE [4]. Mostró los ID 2 y 3 (Figura 6) y no emitió filas ni errores cuando la tabla estaba vacía (F20). Incluye limpieza en CATCH, aunque esa rama no se probó provocando un fallo. El cursor es una demostración académica; para listar productos basta un SELECT.</w:t>
       </w:r>
     </w:p>
     <w:p>
@@ -1587,7 +1587,7 @@
         <w:spacing w:after="120" w:line="276" w:lineRule="auto"/>
       </w:pPr>
       <w:r>
-        <w:t>Cada evidencia permite consultar la operación, los mensajes y el resultado. Las figuras del anexo son una selección; los demás registros están en el repositorio.</w:t>
+        <w:t>La tabla siguiente resume qué se probó y qué ocurrió. Los códigos Fxx permiten encontrar las consultas y sus resultados en el repositorio. El anexo incluye las capturas principales.</w:t>
       </w:r>
     </w:p>
     <w:tbl>
@@ -3302,7 +3302,7 @@
         <w:spacing w:after="120" w:line="276" w:lineRule="auto"/>
       </w:pPr>
       <w:r>
-        <w:t>La prueba revertida no integra los recuentos finales. Otro producto usado para validar UPDATE sí fue confirmado y luego eliminado; su INS y DEL explican el cierre de cuatro acciones de cada tipo. No se probaron concurrencia ni fallos de infraestructura.</w:t>
+        <w:t>El alta que se deshizo con ROLLBACK no cuenta en el resultado final. En cambio, el producto usado para las pruebas de UPDATE sí se guardó y después se eliminó. Su INS y DEL explican el cierre de cuatro movimientos de cada tipo. No se probaron concurrencia ni fallos de infraestructura.</w:t>
       </w:r>
     </w:p>
     <w:p>
@@ -3321,7 +3321,7 @@
         <w:spacing w:after="120" w:line="276" w:lineRule="auto"/>
       </w:pPr>
       <w:r>
-        <w:t>Se utilizaron nombres descriptivos, esquema dbo, comentarios y SET NOCOUNT ON. Las restricciones CHECK respaldan las validaciones. La auditoría trabaja por conjuntos y el cursor permanece separado. Los scripts completos y las definiciones recuperadas se conservan para revisar la implementación.</w:t>
+        <w:t>Para facilitar la lectura del código, se usaron nombres descriptivos, el esquema dbo, comentarios y SET NOCOUNT ON. Las restricciones CHECK refuerzan las validaciones. Los triggers procesan conjuntos de filas y el cursor está en un procedimiento aparte. Los scripts y las definiciones recuperadas quedaron disponibles para revisar la solución.</w:t>
       </w:r>
     </w:p>
     <w:p>
@@ -3340,7 +3340,7 @@
         <w:spacing w:after="120" w:line="276" w:lineRule="auto"/>
       </w:pPr>
       <w:r>
-        <w:t>La solución registró altas y bajas mediante procedimientos y triggers, conservó el historial y rechazó los valores inválidos probados. La auditoría funcionó también con varias filas y terminó con cuatro INS, cuatro DEL y dos UPD.</w:t>
+        <w:t>Las pruebas mostraron que la solución registra las altas y bajas, mantiene el historial y rechaza las entradas inválidas revisadas. También funcionó con varias filas. El resultado final fue el esperado: cuatro INS, cuatro DEL y dos UPD.</w:t>
       </w:r>
     </w:p>
     <w:p>
@@ -3348,7 +3348,7 @@
         <w:spacing w:after="120" w:line="276" w:lineRule="auto"/>
       </w:pPr>
       <w:r>
-        <w:t>Mi primera reflexión es que una operación exitosa no basta para validar una solución. Comparar los estados antes y después y probar entradas incorrectas permitió comprobar qué cambió y qué debía permanecer igual.</w:t>
+        <w:t>Mi primera reflexión es que no basta con ver un mensaje de operación exitosa. Revisar los datos antes y después y probar valores incorrectos permitió comprobar si la solución respondía como correspondía.</w:t>
       </w:r>
     </w:p>
     <w:p>
@@ -3356,7 +3356,7 @@
         <w:spacing w:after="120" w:line="276" w:lineRule="auto"/>
       </w:pPr>
       <w:r>
-        <w:t>Mi segunda reflexión es que el diseño debe ajustarse al motor: en SQL Server se explicó INSTEAD OF. Queda pendiente evaluar concurrencia para un sistema real.</w:t>
+        <w:t>Mi segunda reflexión es que hay que adaptar la solución al motor utilizado. En este caso fue necesario explicar INSTEAD OF en SQL Server. Para llevarlo a un sistema real, faltaría evaluar la concurrencia.</w:t>
       </w:r>
     </w:p>
     <w:p>
@@ -3433,7 +3433,7 @@
         <w:rPr>
           <w:sz w:val="20"/>
         </w:rPr>
-        <w:t>Se utilizó Codex para apoyar la preparación del código, ejecutar pruebas locales, capturar resultados y redactar el informe. Como referencia para organizar este apoyo, se propone una coordinación en la que Claude planifica, analiza errores y entrega instrucciones, y Codex ejecuta las tareas. El proyecto personal claude-work-mcp incorpora herramientas MCP para archivos, notas compartidas Codex–Claude, APIs configuradas y comandos permitidos. Su existencia no acredita que Claude o ese servidor hayan participado en esta ejecución. Repositorio: https://github.com/blaspinto5/claude-work-mcp. Los resultados SQL son reales y los productos son ficticios de prueba.</w:t>
+        <w:t>Para preparar el código, ejecutar las pruebas, capturar los resultados y redactar el informe se contó con apoyo de Codex. Como referencia de organización, se propone que Claude planifique y revise errores y que Codex ejecute las tareas. El proyecto personal claude-work-mcp reúne herramientas MCP para archivos, notas compartidas, APIs configuradas y comandos permitidos. No se registró uso de Claude o de ese servidor en esta ejecución. Referencia: https://github.com/blaspinto5/claude-work-mcp. Los resultados SQL son reales; los productos son datos ficticios de prueba.</w:t>
       </w:r>
     </w:p>
     <w:p>
@@ -3452,7 +3452,7 @@
         <w:spacing w:after="120" w:line="276" w:lineRule="auto"/>
       </w:pPr>
       <w:r>
-        <w:t>Los scripts completos se conservan en el repositorio, carpeta sql: https://github.com/blaspinto5/PRO202-Sumativa-Semana9-SQL/tree/main/sql. Se ejecutan 01_Implementacion.sql y luego 02_Ampliacion_rubrica.sql sobre una base nueva y vacía. Este anexo reproduce los triggers del caso; las definiciones completas y sus consultas de comprobación están vinculadas en la matriz.</w:t>
+        <w:t>El código completo está en la carpeta sql del repositorio: https://github.com/blaspinto5/PRO202-Sumativa-Semana9-SQL/tree/main/sql. Primero se ejecuta 01_Implementacion.sql y después 02_Ampliacion_rubrica.sql, en una base nueva y vacía. Aquí se incluyen los triggers del caso; la matriz permite localizar las definiciones completas y sus comprobaciones.</w:t>
       </w:r>
     </w:p>
     <w:p>
@@ -3698,7 +3698,7 @@
         <w:rPr>
           <w:sz w:val="20"/>
         </w:rPr>
-        <w:t>Selección de capturas auténticas del visor local. Los ID Fxx remiten al registro completo y las 57 capturas del repositorio; las copias de lectura solo recortan márgenes vacíos.</w:t>
+        <w:t>Estas capturas muestran los resultados principales del visor local. Los ID Fxx permiten encontrar el registro completo y las 57 capturas del repositorio. Para mejorar la lectura, las copias solo recortan los márgenes vacíos.</w:t>
       </w:r>
     </w:p>
     <w:p>

</xml_diff>